<commit_message>
Split AI Act risk answer into formative and summative, update V10
Co-Authored-By: Claude Sonnet 5.5 <noreply@anthropic.com>
Claude-Session: https://claude.ai/code/session_01HnPsyJd4oor4hGQJ3HwKJz
</commit_message>
<xml_diff>
--- a/GTM/Knowledge/privacy-vragenlijsten/antwoorden-privacy-it-vragen-2026-10-02.docx
+++ b/GTM/Knowledge/privacy-vragenlijsten/antwoorden-privacy-it-vragen-2026-10-02.docx
@@ -695,21 +695,54 @@
       <w:r>
         <w:rPr>
           <w:rFonts w:ascii="Calibri" w:cs="Calibri" w:eastAsia="Calibri" w:hAnsi="Calibri"/>
+        </w:rPr>
+        <w:t xml:space="preserve">Dat hangt af van het gebruik. De AI Act kent geen laag, midden en hoog, maar de niveaus minimaal, beperkt, hoog en verboden. Voor Eduface geldt:</w:t>
+      </w:r>
+    </w:p>
+    <w:p>
+      <w:pPr>
+        <w:pStyle w:val="ListParagraph"/>
+        <w:numPr>
+          <w:ilvl w:val="0"/>
+          <w:numId w:val="2"/>
+        </w:numPr>
+        <w:spacing w:after="60" w:line="276"/>
+      </w:pPr>
+      <w:r>
+        <w:rPr>
+          <w:rFonts w:ascii="Calibri" w:cs="Calibri" w:eastAsia="Calibri" w:hAnsi="Calibri"/>
+        </w:rPr>
+        <w:t xml:space="preserve">Formatieve feedback (feedback op concepten, zonder cijfer of score): laag. De docent beslist en er volgt geen beoordeling uit. </w:t>
+      </w:r>
+      <w:r>
+        <w:rPr>
+          <w:rFonts w:ascii="Calibri" w:cs="Calibri" w:eastAsia="Calibri" w:hAnsi="Calibri"/>
           <w:shd w:fill="FFF200" w:color="auto" w:val="clear"/>
         </w:rPr>
-        <w:t xml:space="preserve">Te bevestigen door Jeroen: het risicoprofiel dat Eduface zelf hanteert (laag, midden of hoog).</w:t>
-      </w:r>
-    </w:p>
-    <w:p>
-      <w:pPr>
-        <w:spacing w:after="100" w:line="276"/>
-      </w:pPr>
+        <w:t xml:space="preserve">Te bevestigen door Jeroen. Leg de onderbouwing vast onder artikel 6 lid 3 van de AI Act.</w:t>
+      </w:r>
+    </w:p>
+    <w:p>
+      <w:pPr>
+        <w:pStyle w:val="ListParagraph"/>
+        <w:numPr>
+          <w:ilvl w:val="0"/>
+          <w:numId w:val="2"/>
+        </w:numPr>
+        <w:spacing w:after="60" w:line="276"/>
+      </w:pPr>
+      <w:r>
+        <w:rPr>
+          <w:rFonts w:ascii="Calibri" w:cs="Calibri" w:eastAsia="Calibri" w:hAnsi="Calibri"/>
+        </w:rPr>
+        <w:t xml:space="preserve">Summatief gebruik (rubric-scoring en cijfervoorstellen): hoog. De AI Act rekent AI die leerresultaten beoordeelt tot hoog risico (bijlage III). Daarom de menselijke controle en de audit trail. </w:t>
+      </w:r>
       <w:r>
         <w:rPr>
           <w:rFonts w:ascii="Calibri" w:cs="Calibri" w:eastAsia="Calibri" w:hAnsi="Calibri"/>
           <w:shd w:fill="FFF200" w:color="auto" w:val="clear"/>
         </w:rPr>
-        <w:t xml:space="preserve">INTERN, verwijderen voor verzending: de AI Act noemt AI die leerresultaten beoordeelt expliciet als hoog risico (bijlage III). Een antwoord "hoog" ligt dus voor de hand, maar het is een standpunt van Eduface en dus aan Jeroen.</w:t>
+        <w:t xml:space="preserve">Te bevestigen door Jeroen.</w:t>
       </w:r>
     </w:p>
     <w:p>

</xml_diff>